<commit_message>
Advanced operating system 2023 03
</commit_message>
<xml_diff>
--- a/考试复习资料/DBMS--复习资料/【DBMS原理与设计】2023年04月题库考.docx
+++ b/考试复习资料/DBMS--复习资料/【DBMS原理与设计】2023年04月题库考.docx
@@ -5,10 +5,13 @@
     <w:p>
       <w:pPr>
         <w:jc w:val="center"/>
-      </w:pPr>
-      <w:r>
-        <w:rPr>
-          <w:rFonts w:hint="eastAsia"/>
+        <w:rPr>
+          <w:rFonts w:hint="eastAsia" w:ascii="微软雅黑" w:hAnsi="微软雅黑" w:eastAsia="微软雅黑" w:cs="微软雅黑"/>
+        </w:rPr>
+      </w:pPr>
+      <w:r>
+        <w:rPr>
+          <w:rFonts w:hint="eastAsia" w:ascii="微软雅黑" w:hAnsi="微软雅黑" w:eastAsia="微软雅黑" w:cs="微软雅黑"/>
         </w:rPr>
         <w:t>2023年4月北京DBMS题库考试题</w:t>
       </w:r>
@@ -16,37 +19,47 @@
     <w:p>
       <w:pPr>
         <w:outlineLvl w:val="0"/>
-      </w:pPr>
-      <w:r>
-        <w:rPr>
-          <w:rFonts w:hint="eastAsia"/>
+        <w:rPr>
+          <w:rFonts w:hint="eastAsia" w:ascii="微软雅黑" w:hAnsi="微软雅黑" w:eastAsia="微软雅黑" w:cs="微软雅黑"/>
+        </w:rPr>
+      </w:pPr>
+      <w:r>
+        <w:rPr>
+          <w:rFonts w:hint="eastAsia" w:ascii="微软雅黑" w:hAnsi="微软雅黑" w:eastAsia="微软雅黑" w:cs="微软雅黑"/>
         </w:rPr>
         <w:t>一、</w:t>
       </w:r>
       <w:r>
+        <w:rPr>
+          <w:rFonts w:hint="eastAsia" w:ascii="微软雅黑" w:hAnsi="微软雅黑" w:eastAsia="微软雅黑" w:cs="微软雅黑"/>
+        </w:rPr>
         <w:t>名</w:t>
       </w:r>
       <w:r>
         <w:rPr>
-          <w:rFonts w:hint="eastAsia"/>
+          <w:rFonts w:hint="eastAsia" w:ascii="微软雅黑" w:hAnsi="微软雅黑" w:eastAsia="微软雅黑" w:cs="微软雅黑"/>
         </w:rPr>
         <w:t>词</w:t>
       </w:r>
       <w:r>
+        <w:rPr>
+          <w:rFonts w:hint="eastAsia" w:ascii="微软雅黑" w:hAnsi="微软雅黑" w:eastAsia="微软雅黑" w:cs="微软雅黑"/>
+        </w:rPr>
         <w:t>解释</w:t>
       </w:r>
     </w:p>
     <w:p>
       <w:pPr>
         <w:rPr>
-          <w:rFonts w:hint="default" w:eastAsiaTheme="minorEastAsia"/>
-          <w:b w:val="0"/>
-          <w:bCs w:val="0"/>
-          <w:lang w:val="en-US" w:eastAsia="zh-CN"/>
-        </w:rPr>
-      </w:pPr>
-      <w:r>
-        <w:rPr>
+          <w:rFonts w:hint="eastAsia" w:ascii="微软雅黑" w:hAnsi="微软雅黑" w:eastAsia="微软雅黑" w:cs="微软雅黑"/>
+          <w:b w:val="0"/>
+          <w:bCs w:val="0"/>
+          <w:lang w:val="en-US" w:eastAsia="zh-CN"/>
+        </w:rPr>
+      </w:pPr>
+      <w:r>
+        <w:rPr>
+          <w:rFonts w:hint="eastAsia" w:ascii="微软雅黑" w:hAnsi="微软雅黑" w:eastAsia="微软雅黑" w:cs="微软雅黑"/>
           <w:b/>
           <w:bCs/>
         </w:rPr>
@@ -54,7 +67,7 @@
       </w:r>
       <w:r>
         <w:rPr>
-          <w:rFonts w:hint="eastAsia"/>
+          <w:rFonts w:hint="eastAsia" w:ascii="微软雅黑" w:hAnsi="微软雅黑" w:eastAsia="微软雅黑" w:cs="微软雅黑"/>
           <w:b/>
           <w:bCs/>
           <w:lang w:eastAsia="zh-CN"/>
@@ -63,7 +76,7 @@
       </w:r>
       <w:r>
         <w:rPr>
-          <w:rFonts w:hint="eastAsia"/>
+          <w:rFonts w:hint="eastAsia" w:ascii="微软雅黑" w:hAnsi="微软雅黑" w:eastAsia="微软雅黑" w:cs="微软雅黑"/>
           <w:b w:val="0"/>
           <w:bCs w:val="0"/>
           <w:lang w:val="en-US" w:eastAsia="zh-CN"/>
@@ -74,14 +87,15 @@
     <w:p>
       <w:pPr>
         <w:rPr>
-          <w:rFonts w:hint="default" w:eastAsiaTheme="minorEastAsia"/>
-          <w:b/>
-          <w:bCs/>
-          <w:lang w:val="en-US" w:eastAsia="zh-CN"/>
-        </w:rPr>
-      </w:pPr>
-      <w:r>
-        <w:rPr>
+          <w:rFonts w:hint="eastAsia" w:ascii="微软雅黑" w:hAnsi="微软雅黑" w:eastAsia="微软雅黑" w:cs="微软雅黑"/>
+          <w:b/>
+          <w:bCs/>
+          <w:lang w:val="en-US" w:eastAsia="zh-CN"/>
+        </w:rPr>
+      </w:pPr>
+      <w:r>
+        <w:rPr>
+          <w:rFonts w:hint="eastAsia" w:ascii="微软雅黑" w:hAnsi="微软雅黑" w:eastAsia="微软雅黑" w:cs="微软雅黑"/>
           <w:b/>
           <w:bCs/>
         </w:rPr>
@@ -89,7 +103,7 @@
       </w:r>
       <w:r>
         <w:rPr>
-          <w:rFonts w:hint="eastAsia"/>
+          <w:rFonts w:hint="eastAsia" w:ascii="微软雅黑" w:hAnsi="微软雅黑" w:eastAsia="微软雅黑" w:cs="微软雅黑"/>
           <w:b/>
           <w:bCs/>
           <w:lang w:eastAsia="zh-CN"/>
@@ -98,7 +112,7 @@
       </w:r>
       <w:r>
         <w:rPr>
-          <w:rFonts w:hint="eastAsia"/>
+          <w:rFonts w:hint="eastAsia" w:ascii="微软雅黑" w:hAnsi="微软雅黑" w:eastAsia="微软雅黑" w:cs="微软雅黑"/>
           <w:b w:val="0"/>
           <w:bCs w:val="0"/>
           <w:lang w:val="en-US" w:eastAsia="zh-CN"/>
@@ -109,14 +123,15 @@
     <w:p>
       <w:pPr>
         <w:rPr>
-          <w:rFonts w:hint="default" w:eastAsiaTheme="minorEastAsia"/>
-          <w:b w:val="0"/>
-          <w:bCs w:val="0"/>
-          <w:lang w:val="en-US" w:eastAsia="zh-CN"/>
-        </w:rPr>
-      </w:pPr>
-      <w:r>
-        <w:rPr>
+          <w:rFonts w:hint="eastAsia" w:ascii="微软雅黑" w:hAnsi="微软雅黑" w:eastAsia="微软雅黑" w:cs="微软雅黑"/>
+          <w:b w:val="0"/>
+          <w:bCs w:val="0"/>
+          <w:lang w:val="en-US" w:eastAsia="zh-CN"/>
+        </w:rPr>
+      </w:pPr>
+      <w:r>
+        <w:rPr>
+          <w:rFonts w:hint="eastAsia" w:ascii="微软雅黑" w:hAnsi="微软雅黑" w:eastAsia="微软雅黑" w:cs="微软雅黑"/>
           <w:b/>
           <w:bCs/>
         </w:rPr>
@@ -124,7 +139,7 @@
       </w:r>
       <w:r>
         <w:rPr>
-          <w:rFonts w:hint="eastAsia"/>
+          <w:rFonts w:hint="eastAsia" w:ascii="微软雅黑" w:hAnsi="微软雅黑" w:eastAsia="微软雅黑" w:cs="微软雅黑"/>
           <w:b/>
           <w:bCs/>
           <w:lang w:eastAsia="zh-CN"/>
@@ -133,7 +148,7 @@
       </w:r>
       <w:r>
         <w:rPr>
-          <w:rFonts w:hint="eastAsia"/>
+          <w:rFonts w:hint="eastAsia" w:ascii="微软雅黑" w:hAnsi="微软雅黑" w:eastAsia="微软雅黑" w:cs="微软雅黑"/>
           <w:b w:val="0"/>
           <w:bCs w:val="0"/>
           <w:lang w:val="en-US" w:eastAsia="zh-CN"/>
@@ -144,14 +159,15 @@
     <w:p>
       <w:pPr>
         <w:rPr>
-          <w:rFonts w:hint="default" w:eastAsiaTheme="minorEastAsia"/>
-          <w:b w:val="0"/>
-          <w:bCs w:val="0"/>
-          <w:lang w:val="en-US" w:eastAsia="zh-CN"/>
-        </w:rPr>
-      </w:pPr>
-      <w:r>
-        <w:rPr>
+          <w:rFonts w:hint="eastAsia" w:ascii="微软雅黑" w:hAnsi="微软雅黑" w:eastAsia="微软雅黑" w:cs="微软雅黑"/>
+          <w:b w:val="0"/>
+          <w:bCs w:val="0"/>
+          <w:lang w:val="en-US" w:eastAsia="zh-CN"/>
+        </w:rPr>
+      </w:pPr>
+      <w:r>
+        <w:rPr>
+          <w:rFonts w:hint="eastAsia" w:ascii="微软雅黑" w:hAnsi="微软雅黑" w:eastAsia="微软雅黑" w:cs="微软雅黑"/>
           <w:b/>
           <w:bCs/>
         </w:rPr>
@@ -159,7 +175,7 @@
       </w:r>
       <w:r>
         <w:rPr>
-          <w:rFonts w:hint="eastAsia"/>
+          <w:rFonts w:hint="eastAsia" w:ascii="微软雅黑" w:hAnsi="微软雅黑" w:eastAsia="微软雅黑" w:cs="微软雅黑"/>
           <w:b/>
           <w:bCs/>
           <w:lang w:eastAsia="zh-CN"/>
@@ -168,7 +184,7 @@
       </w:r>
       <w:r>
         <w:rPr>
-          <w:rFonts w:hint="eastAsia"/>
+          <w:rFonts w:hint="eastAsia" w:ascii="微软雅黑" w:hAnsi="微软雅黑" w:eastAsia="微软雅黑" w:cs="微软雅黑"/>
           <w:b w:val="0"/>
           <w:bCs w:val="0"/>
           <w:lang w:val="en-US" w:eastAsia="zh-CN"/>
@@ -177,21 +193,45 @@
       </w:r>
     </w:p>
     <w:p>
-      <w:r>
+      <w:pPr>
+        <w:rPr>
+          <w:rFonts w:hint="eastAsia" w:ascii="微软雅黑" w:hAnsi="微软雅黑" w:eastAsia="微软雅黑" w:cs="微软雅黑"/>
+          <w:lang w:val="en-US" w:eastAsia="zh-CN"/>
+        </w:rPr>
+      </w:pPr>
+      <w:r>
+        <w:rPr>
+          <w:rFonts w:hint="eastAsia" w:ascii="微软雅黑" w:hAnsi="微软雅黑" w:eastAsia="微软雅黑" w:cs="微软雅黑"/>
+        </w:rPr>
         <w:t>元数据</w:t>
       </w:r>
-    </w:p>
-    <w:p>
-      <w:pPr>
-        <w:rPr>
-          <w:rFonts w:hint="default" w:eastAsiaTheme="minorEastAsia"/>
-          <w:b w:val="0"/>
-          <w:bCs w:val="0"/>
-          <w:lang w:val="en-US" w:eastAsia="zh-CN"/>
-        </w:rPr>
-      </w:pPr>
-      <w:r>
-        <w:rPr>
+      <w:r>
+        <w:rPr>
+          <w:rFonts w:hint="eastAsia" w:ascii="微软雅黑" w:hAnsi="微软雅黑" w:eastAsia="微软雅黑" w:cs="微软雅黑"/>
+          <w:lang w:eastAsia="zh-CN"/>
+        </w:rPr>
+        <w:t>：</w:t>
+      </w:r>
+      <w:r>
+        <w:rPr>
+          <w:rFonts w:hint="eastAsia" w:ascii="微软雅黑" w:hAnsi="微软雅黑" w:eastAsia="微软雅黑" w:cs="微软雅黑"/>
+          <w:lang w:val="en-US" w:eastAsia="zh-CN"/>
+        </w:rPr>
+        <w:t>就是关于数据的数据</w:t>
+      </w:r>
+    </w:p>
+    <w:p>
+      <w:pPr>
+        <w:rPr>
+          <w:rFonts w:hint="eastAsia" w:ascii="微软雅黑" w:hAnsi="微软雅黑" w:eastAsia="微软雅黑" w:cs="微软雅黑"/>
+          <w:b w:val="0"/>
+          <w:bCs w:val="0"/>
+          <w:lang w:val="en-US" w:eastAsia="zh-CN"/>
+        </w:rPr>
+      </w:pPr>
+      <w:r>
+        <w:rPr>
+          <w:rFonts w:hint="eastAsia" w:ascii="微软雅黑" w:hAnsi="微软雅黑" w:eastAsia="微软雅黑" w:cs="微软雅黑"/>
           <w:b/>
           <w:bCs/>
         </w:rPr>
@@ -199,7 +239,7 @@
       </w:r>
       <w:r>
         <w:rPr>
-          <w:rFonts w:hint="eastAsia"/>
+          <w:rFonts w:hint="eastAsia" w:ascii="微软雅黑" w:hAnsi="微软雅黑" w:eastAsia="微软雅黑" w:cs="微软雅黑"/>
           <w:b/>
           <w:bCs/>
           <w:lang w:eastAsia="zh-CN"/>
@@ -208,25 +248,26 @@
       </w:r>
       <w:r>
         <w:rPr>
-          <w:rFonts w:hint="eastAsia"/>
-          <w:b w:val="0"/>
-          <w:bCs w:val="0"/>
-          <w:lang w:val="en-US" w:eastAsia="zh-CN"/>
-        </w:rPr>
-        <w:t>不能沿时间维做聚集运算的度量，例：存量</w:t>
-      </w:r>
-    </w:p>
-    <w:p>
-      <w:pPr>
-        <w:rPr>
-          <w:rFonts w:hint="default" w:eastAsiaTheme="minorEastAsia"/>
-          <w:b w:val="0"/>
-          <w:bCs w:val="0"/>
-          <w:lang w:val="en-US" w:eastAsia="zh-CN"/>
-        </w:rPr>
-      </w:pPr>
-      <w:r>
-        <w:rPr>
+          <w:rFonts w:hint="eastAsia" w:ascii="微软雅黑" w:hAnsi="微软雅黑" w:eastAsia="微软雅黑" w:cs="微软雅黑"/>
+          <w:b w:val="0"/>
+          <w:bCs w:val="0"/>
+          <w:lang w:val="en-US" w:eastAsia="zh-CN"/>
+        </w:rPr>
+        <w:t>不能沿时间维做聚集运算的度量，例：库存量</w:t>
+      </w:r>
+    </w:p>
+    <w:p>
+      <w:pPr>
+        <w:rPr>
+          <w:rFonts w:hint="eastAsia" w:ascii="微软雅黑" w:hAnsi="微软雅黑" w:eastAsia="微软雅黑" w:cs="微软雅黑"/>
+          <w:b w:val="0"/>
+          <w:bCs w:val="0"/>
+          <w:lang w:val="en-US" w:eastAsia="zh-CN"/>
+        </w:rPr>
+      </w:pPr>
+      <w:r>
+        <w:rPr>
+          <w:rFonts w:hint="eastAsia" w:ascii="微软雅黑" w:hAnsi="微软雅黑" w:eastAsia="微软雅黑" w:cs="微软雅黑"/>
           <w:b/>
           <w:bCs/>
         </w:rPr>
@@ -234,7 +275,7 @@
       </w:r>
       <w:r>
         <w:rPr>
-          <w:rFonts w:hint="eastAsia"/>
+          <w:rFonts w:hint="eastAsia" w:ascii="微软雅黑" w:hAnsi="微软雅黑" w:eastAsia="微软雅黑" w:cs="微软雅黑"/>
           <w:b/>
           <w:bCs/>
           <w:lang w:eastAsia="zh-CN"/>
@@ -243,7 +284,7 @@
       </w:r>
       <w:r>
         <w:rPr>
-          <w:rFonts w:hint="eastAsia"/>
+          <w:rFonts w:hint="eastAsia" w:ascii="微软雅黑" w:hAnsi="微软雅黑" w:eastAsia="微软雅黑" w:cs="微软雅黑"/>
           <w:b w:val="0"/>
           <w:bCs w:val="0"/>
           <w:lang w:val="en-US" w:eastAsia="zh-CN"/>
@@ -251,30 +292,44 @@
         <w:t>将清洗后的数据按数据仓库的主题进行组织</w:t>
       </w:r>
     </w:p>
-    <w:p/>
+    <w:p>
+      <w:pPr>
+        <w:rPr>
+          <w:rFonts w:hint="eastAsia" w:ascii="微软雅黑" w:hAnsi="微软雅黑" w:eastAsia="微软雅黑" w:cs="微软雅黑"/>
+        </w:rPr>
+      </w:pPr>
+    </w:p>
     <w:p>
       <w:pPr>
         <w:outlineLvl w:val="0"/>
-      </w:pPr>
-      <w:r>
-        <w:rPr>
-          <w:rFonts w:hint="eastAsia"/>
+        <w:rPr>
+          <w:rFonts w:hint="eastAsia" w:ascii="微软雅黑" w:hAnsi="微软雅黑" w:eastAsia="微软雅黑" w:cs="微软雅黑"/>
+        </w:rPr>
+      </w:pPr>
+      <w:r>
+        <w:rPr>
+          <w:rFonts w:hint="eastAsia" w:ascii="微软雅黑" w:hAnsi="微软雅黑" w:eastAsia="微软雅黑" w:cs="微软雅黑"/>
         </w:rPr>
         <w:t>二、</w:t>
       </w:r>
       <w:r>
+        <w:rPr>
+          <w:rFonts w:hint="eastAsia" w:ascii="微软雅黑" w:hAnsi="微软雅黑" w:eastAsia="微软雅黑" w:cs="微软雅黑"/>
+        </w:rPr>
         <w:t>简答题</w:t>
       </w:r>
     </w:p>
     <w:p>
       <w:pPr>
         <w:rPr>
-          <w:b/>
-          <w:bCs/>
-        </w:rPr>
-      </w:pPr>
-      <w:r>
-        <w:rPr>
+          <w:rFonts w:hint="eastAsia" w:ascii="微软雅黑" w:hAnsi="微软雅黑" w:eastAsia="微软雅黑" w:cs="微软雅黑"/>
+          <w:b/>
+          <w:bCs/>
+        </w:rPr>
+      </w:pPr>
+      <w:r>
+        <w:rPr>
+          <w:rFonts w:hint="eastAsia" w:ascii="微软雅黑" w:hAnsi="微软雅黑" w:eastAsia="微软雅黑" w:cs="微软雅黑"/>
           <w:b/>
           <w:bCs/>
         </w:rPr>
@@ -284,13 +339,13 @@
     <w:p>
       <w:pPr>
         <w:rPr>
-          <w:rFonts w:hint="eastAsia"/>
-          <w:lang w:val="en-US" w:eastAsia="zh-CN"/>
-        </w:rPr>
-      </w:pPr>
-      <w:r>
-        <w:rPr>
-          <w:rFonts w:hint="eastAsia"/>
+          <w:rFonts w:hint="eastAsia" w:ascii="微软雅黑" w:hAnsi="微软雅黑" w:eastAsia="微软雅黑" w:cs="微软雅黑"/>
+          <w:lang w:val="en-US" w:eastAsia="zh-CN"/>
+        </w:rPr>
+      </w:pPr>
+      <w:r>
+        <w:rPr>
+          <w:rFonts w:hint="eastAsia" w:ascii="微软雅黑" w:hAnsi="微软雅黑" w:eastAsia="微软雅黑" w:cs="微软雅黑"/>
           <w:lang w:val="en-US" w:eastAsia="zh-CN"/>
         </w:rPr>
         <w:t>旋转：把一个横向时为时间，纵向为产品的报表旋转成为横向为产品、纵向为时间的报表。旋转操作是一个列换到行的操作。</w:t>
@@ -299,13 +354,13 @@
     <w:p>
       <w:pPr>
         <w:rPr>
-          <w:rFonts w:hint="eastAsia"/>
-          <w:lang w:val="en-US" w:eastAsia="zh-CN"/>
-        </w:rPr>
-      </w:pPr>
-      <w:r>
-        <w:rPr>
-          <w:rFonts w:hint="eastAsia"/>
+          <w:rFonts w:hint="eastAsia" w:ascii="微软雅黑" w:hAnsi="微软雅黑" w:eastAsia="微软雅黑" w:cs="微软雅黑"/>
+          <w:lang w:val="en-US" w:eastAsia="zh-CN"/>
+        </w:rPr>
+      </w:pPr>
+      <w:r>
+        <w:rPr>
+          <w:rFonts w:hint="eastAsia" w:ascii="微软雅黑" w:hAnsi="微软雅黑" w:eastAsia="微软雅黑" w:cs="微软雅黑"/>
           <w:lang w:val="en-US" w:eastAsia="zh-CN"/>
         </w:rPr>
         <w:t>切片：在数据方体的某一维上选定一个维成员的动作称为切片。例：在在一个多维数据，选择一个时间维组织起来的数据，就做一个时间维上的分片</w:t>
@@ -314,13 +369,13 @@
     <w:p>
       <w:pPr>
         <w:rPr>
-          <w:rFonts w:hint="eastAsia"/>
-          <w:lang w:val="en-US" w:eastAsia="zh-CN"/>
-        </w:rPr>
-      </w:pPr>
-      <w:r>
-        <w:rPr>
-          <w:rFonts w:hint="eastAsia"/>
+          <w:rFonts w:hint="eastAsia" w:ascii="微软雅黑" w:hAnsi="微软雅黑" w:eastAsia="微软雅黑" w:cs="微软雅黑"/>
+          <w:lang w:val="en-US" w:eastAsia="zh-CN"/>
+        </w:rPr>
+      </w:pPr>
+      <w:r>
+        <w:rPr>
+          <w:rFonts w:hint="eastAsia" w:ascii="微软雅黑" w:hAnsi="微软雅黑" w:eastAsia="微软雅黑" w:cs="微软雅黑"/>
           <w:lang w:val="en-US" w:eastAsia="zh-CN"/>
         </w:rPr>
         <w:t>切块：在时间维上取值设定为一个区间，就可以得到一个数据切块。</w:t>
@@ -329,20 +384,22 @@
     <w:p>
       <w:pPr>
         <w:rPr>
-          <w:rFonts w:hint="default"/>
-          <w:lang w:val="en-US" w:eastAsia="zh-CN"/>
-        </w:rPr>
-      </w:pPr>
-    </w:p>
-    <w:p>
-      <w:pPr>
-        <w:rPr>
-          <w:b/>
-          <w:bCs/>
-        </w:rPr>
-      </w:pPr>
-      <w:r>
-        <w:rPr>
+          <w:rFonts w:hint="eastAsia" w:ascii="微软雅黑" w:hAnsi="微软雅黑" w:eastAsia="微软雅黑" w:cs="微软雅黑"/>
+          <w:lang w:val="en-US" w:eastAsia="zh-CN"/>
+        </w:rPr>
+      </w:pPr>
+    </w:p>
+    <w:p>
+      <w:pPr>
+        <w:rPr>
+          <w:rFonts w:hint="eastAsia" w:ascii="微软雅黑" w:hAnsi="微软雅黑" w:eastAsia="微软雅黑" w:cs="微软雅黑"/>
+          <w:b/>
+          <w:bCs/>
+        </w:rPr>
+      </w:pPr>
+      <w:r>
+        <w:rPr>
+          <w:rFonts w:hint="eastAsia" w:ascii="微软雅黑" w:hAnsi="微软雅黑" w:eastAsia="微软雅黑" w:cs="微软雅黑"/>
           <w:b/>
           <w:bCs/>
         </w:rPr>
@@ -352,13 +409,13 @@
     <w:p>
       <w:pPr>
         <w:rPr>
-          <w:rFonts w:hint="default"/>
-          <w:lang w:val="en-US" w:eastAsia="zh-CN"/>
-        </w:rPr>
-      </w:pPr>
-      <w:r>
-        <w:rPr>
-          <w:rFonts w:hint="eastAsia"/>
+          <w:rFonts w:hint="eastAsia" w:ascii="微软雅黑" w:hAnsi="微软雅黑" w:eastAsia="微软雅黑" w:cs="微软雅黑"/>
+          <w:lang w:val="en-US" w:eastAsia="zh-CN"/>
+        </w:rPr>
+      </w:pPr>
+      <w:r>
+        <w:rPr>
+          <w:rFonts w:hint="eastAsia" w:ascii="微软雅黑" w:hAnsi="微软雅黑" w:eastAsia="微软雅黑" w:cs="微软雅黑"/>
           <w:lang w:val="en-US" w:eastAsia="zh-CN"/>
         </w:rPr>
         <w:t>数据仓库由数据源、集成工具、数据仓库与数据仓库服务器、联机分析处理服务器、元数据与元数据管理工具、数据集市和前端分析工具等组成。数据仓库的体系结构分类有：1、两层架构，2、独立型数据集市，3、依赖型数据集市和操作型数据存储，4、逻辑型数据集市和实时数据仓库</w:t>
@@ -367,20 +424,22 @@
     <w:p>
       <w:pPr>
         <w:rPr>
-          <w:rFonts w:hint="default"/>
-          <w:lang w:val="en-US" w:eastAsia="zh-CN"/>
-        </w:rPr>
-      </w:pPr>
-    </w:p>
-    <w:p>
-      <w:pPr>
-        <w:rPr>
-          <w:b/>
-          <w:bCs/>
-        </w:rPr>
-      </w:pPr>
-      <w:r>
-        <w:rPr>
+          <w:rFonts w:hint="eastAsia" w:ascii="微软雅黑" w:hAnsi="微软雅黑" w:eastAsia="微软雅黑" w:cs="微软雅黑"/>
+          <w:lang w:val="en-US" w:eastAsia="zh-CN"/>
+        </w:rPr>
+      </w:pPr>
+    </w:p>
+    <w:p>
+      <w:pPr>
+        <w:rPr>
+          <w:rFonts w:hint="eastAsia" w:ascii="微软雅黑" w:hAnsi="微软雅黑" w:eastAsia="微软雅黑" w:cs="微软雅黑"/>
+          <w:b/>
+          <w:bCs/>
+        </w:rPr>
+      </w:pPr>
+      <w:r>
+        <w:rPr>
+          <w:rFonts w:hint="eastAsia" w:ascii="微软雅黑" w:hAnsi="微软雅黑" w:eastAsia="微软雅黑" w:cs="微软雅黑"/>
           <w:b/>
           <w:bCs/>
         </w:rPr>
@@ -390,21 +449,85 @@
     <w:p>
       <w:pPr>
         <w:rPr>
-          <w:b/>
-          <w:bCs/>
-        </w:rPr>
-      </w:pPr>
-    </w:p>
-    <w:p>
-      <w:pPr>
-        <w:rPr>
-          <w:rFonts w:hint="eastAsia"/>
-          <w:b/>
-          <w:bCs/>
-        </w:rPr>
-      </w:pPr>
-      <w:r>
-        <w:rPr>
+          <w:rFonts w:hint="eastAsia" w:ascii="微软雅黑" w:hAnsi="微软雅黑" w:eastAsia="微软雅黑" w:cs="微软雅黑"/>
+          <w:lang w:val="en-US" w:eastAsia="zh-CN"/>
+        </w:rPr>
+      </w:pPr>
+      <w:r>
+        <w:rPr>
+          <w:rFonts w:hint="eastAsia" w:ascii="微软雅黑" w:hAnsi="微软雅黑" w:eastAsia="微软雅黑" w:cs="微软雅黑"/>
+          <w:lang w:val="en-US" w:eastAsia="zh-CN"/>
+        </w:rPr>
+        <w:t>基于直方图分析离散化：该方法将属性值分割在不相交的范围内，称为桶或箱，是一种无监督的方法。</w:t>
+      </w:r>
+    </w:p>
+    <w:p>
+      <w:pPr>
+        <w:rPr>
+          <w:rFonts w:hint="eastAsia" w:ascii="微软雅黑" w:hAnsi="微软雅黑" w:eastAsia="微软雅黑" w:cs="微软雅黑"/>
+          <w:lang w:val="en-US" w:eastAsia="zh-CN"/>
+        </w:rPr>
+      </w:pPr>
+      <w:r>
+        <w:rPr>
+          <w:rFonts w:hint="eastAsia" w:ascii="微软雅黑" w:hAnsi="微软雅黑" w:eastAsia="微软雅黑" w:cs="微软雅黑"/>
+          <w:lang w:val="en-US" w:eastAsia="zh-CN"/>
+        </w:rPr>
+        <w:t>基于聚类分析离散化：该方法通过将数值属性的值分割到不同的类或组中，是一种无监督的方法。</w:t>
+      </w:r>
+    </w:p>
+    <w:p>
+      <w:pPr>
+        <w:rPr>
+          <w:rFonts w:hint="eastAsia" w:ascii="微软雅黑" w:hAnsi="微软雅黑" w:eastAsia="微软雅黑" w:cs="微软雅黑"/>
+          <w:lang w:val="en-US" w:eastAsia="zh-CN"/>
+        </w:rPr>
+      </w:pPr>
+      <w:r>
+        <w:rPr>
+          <w:rFonts w:hint="eastAsia" w:ascii="微软雅黑" w:hAnsi="微软雅黑" w:eastAsia="微软雅黑" w:cs="微软雅黑"/>
+          <w:lang w:val="en-US" w:eastAsia="zh-CN"/>
+        </w:rPr>
+        <w:t>基于决策树分析离散化：该方法采用自上而下的分割方法，是一种有监督的方法。为了离散化数值属性，该方法选择具有最小熵的属性值作为分割点，并递归地划分所得的区间以实现分层离散化。</w:t>
+      </w:r>
+    </w:p>
+    <w:p>
+      <w:pPr>
+        <w:rPr>
+          <w:rFonts w:hint="eastAsia" w:ascii="微软雅黑" w:hAnsi="微软雅黑" w:eastAsia="微软雅黑" w:cs="微软雅黑"/>
+          <w:lang w:val="en-US" w:eastAsia="zh-CN"/>
+        </w:rPr>
+      </w:pPr>
+      <w:r>
+        <w:rPr>
+          <w:rFonts w:hint="eastAsia" w:ascii="微软雅黑" w:hAnsi="微软雅黑" w:eastAsia="微软雅黑" w:cs="微软雅黑"/>
+          <w:lang w:val="en-US" w:eastAsia="zh-CN"/>
+        </w:rPr>
+        <w:t>基于相关分析离散化：该技术采用自下而上的方法，通过发现最佳近邻区间，然后递归地将它们合并成更大的区间，这是一种有监督的方法。</w:t>
+      </w:r>
+      <w:bookmarkStart w:id="0" w:name="_GoBack"/>
+      <w:bookmarkEnd w:id="0"/>
+    </w:p>
+    <w:p>
+      <w:pPr>
+        <w:rPr>
+          <w:rFonts w:hint="eastAsia" w:ascii="微软雅黑" w:hAnsi="微软雅黑" w:eastAsia="微软雅黑" w:cs="微软雅黑"/>
+          <w:b/>
+          <w:bCs/>
+        </w:rPr>
+      </w:pPr>
+    </w:p>
+    <w:p>
+      <w:pPr>
+        <w:rPr>
+          <w:rFonts w:hint="eastAsia" w:ascii="微软雅黑" w:hAnsi="微软雅黑" w:eastAsia="微软雅黑" w:cs="微软雅黑"/>
+          <w:b/>
+          <w:bCs/>
+        </w:rPr>
+      </w:pPr>
+      <w:r>
+        <w:rPr>
+          <w:rFonts w:hint="eastAsia" w:ascii="微软雅黑" w:hAnsi="微软雅黑" w:eastAsia="微软雅黑" w:cs="微软雅黑"/>
           <w:b/>
           <w:bCs/>
         </w:rPr>
@@ -412,7 +535,7 @@
       </w:r>
       <w:r>
         <w:rPr>
-          <w:rFonts w:hint="eastAsia"/>
+          <w:rFonts w:hint="eastAsia" w:ascii="微软雅黑" w:hAnsi="微软雅黑" w:eastAsia="微软雅黑" w:cs="微软雅黑"/>
           <w:b/>
           <w:bCs/>
         </w:rPr>
@@ -426,13 +549,13 @@
           <w:numId w:val="1"/>
         </w:numPr>
         <w:rPr>
-          <w:rFonts w:hint="eastAsia"/>
-          <w:lang w:val="en-US" w:eastAsia="zh-CN"/>
-        </w:rPr>
-      </w:pPr>
-      <w:r>
-        <w:rPr>
-          <w:rFonts w:hint="eastAsia"/>
+          <w:rFonts w:hint="eastAsia" w:ascii="微软雅黑" w:hAnsi="微软雅黑" w:eastAsia="微软雅黑" w:cs="微软雅黑"/>
+          <w:lang w:val="en-US" w:eastAsia="zh-CN"/>
+        </w:rPr>
+      </w:pPr>
+      <w:r>
+        <w:rPr>
+          <w:rFonts w:hint="eastAsia" w:ascii="微软雅黑" w:hAnsi="微软雅黑" w:eastAsia="微软雅黑" w:cs="微软雅黑"/>
           <w:lang w:val="en-US" w:eastAsia="zh-CN"/>
         </w:rPr>
         <w:t>快速性：系统应能在很短的时间内对用户的大部分分析要求做出反应</w:t>
@@ -445,13 +568,13 @@
           <w:numId w:val="1"/>
         </w:numPr>
         <w:rPr>
-          <w:rFonts w:hint="default"/>
-          <w:lang w:val="en-US" w:eastAsia="zh-CN"/>
-        </w:rPr>
-      </w:pPr>
-      <w:r>
-        <w:rPr>
-          <w:rFonts w:hint="eastAsia"/>
+          <w:rFonts w:hint="eastAsia" w:ascii="微软雅黑" w:hAnsi="微软雅黑" w:eastAsia="微软雅黑" w:cs="微软雅黑"/>
+          <w:lang w:val="en-US" w:eastAsia="zh-CN"/>
+        </w:rPr>
+      </w:pPr>
+      <w:r>
+        <w:rPr>
+          <w:rFonts w:hint="eastAsia" w:ascii="微软雅黑" w:hAnsi="微软雅黑" w:eastAsia="微软雅黑" w:cs="微软雅黑"/>
           <w:lang w:val="en-US" w:eastAsia="zh-CN"/>
         </w:rPr>
         <w:t>可分析性：系统能处理与应用有关的各种逻辑分析和统计分析</w:t>
@@ -464,13 +587,13 @@
           <w:numId w:val="1"/>
         </w:numPr>
         <w:rPr>
-          <w:rFonts w:hint="default"/>
-          <w:lang w:val="en-US" w:eastAsia="zh-CN"/>
-        </w:rPr>
-      </w:pPr>
-      <w:r>
-        <w:rPr>
-          <w:rFonts w:hint="eastAsia"/>
+          <w:rFonts w:hint="eastAsia" w:ascii="微软雅黑" w:hAnsi="微软雅黑" w:eastAsia="微软雅黑" w:cs="微软雅黑"/>
+          <w:lang w:val="en-US" w:eastAsia="zh-CN"/>
+        </w:rPr>
+      </w:pPr>
+      <w:r>
+        <w:rPr>
+          <w:rFonts w:hint="eastAsia" w:ascii="微软雅黑" w:hAnsi="微软雅黑" w:eastAsia="微软雅黑" w:cs="微软雅黑"/>
           <w:lang w:val="en-US" w:eastAsia="zh-CN"/>
         </w:rPr>
         <w:t>多维性：系统必须提供对数据的多维视图和分析，包括对维层次和多重维层次的完全支持</w:t>
@@ -483,13 +606,13 @@
           <w:numId w:val="1"/>
         </w:numPr>
         <w:rPr>
-          <w:rFonts w:hint="default"/>
-          <w:lang w:val="en-US" w:eastAsia="zh-CN"/>
-        </w:rPr>
-      </w:pPr>
-      <w:r>
-        <w:rPr>
-          <w:rFonts w:hint="eastAsia"/>
+          <w:rFonts w:hint="eastAsia" w:ascii="微软雅黑" w:hAnsi="微软雅黑" w:eastAsia="微软雅黑" w:cs="微软雅黑"/>
+          <w:lang w:val="en-US" w:eastAsia="zh-CN"/>
+        </w:rPr>
+      </w:pPr>
+      <w:r>
+        <w:rPr>
+          <w:rFonts w:hint="eastAsia" w:ascii="微软雅黑" w:hAnsi="微软雅黑" w:eastAsia="微软雅黑" w:cs="微软雅黑"/>
           <w:lang w:val="en-US" w:eastAsia="zh-CN"/>
         </w:rPr>
         <w:t>及时性：不论数据量多大，也不管数据存储在何处，系统应能及时获得信息，并且管理少量信息</w:t>
@@ -498,23 +621,26 @@
     <w:p>
       <w:pPr>
         <w:numPr>
+          <w:ilvl w:val="0"/>
           <w:numId w:val="0"/>
         </w:numPr>
         <w:rPr>
-          <w:rFonts w:hint="default"/>
-          <w:lang w:val="en-US" w:eastAsia="zh-CN"/>
-        </w:rPr>
-      </w:pPr>
-    </w:p>
-    <w:p>
-      <w:pPr>
-        <w:rPr>
-          <w:b/>
-          <w:bCs/>
-        </w:rPr>
-      </w:pPr>
-      <w:r>
-        <w:rPr>
+          <w:rFonts w:hint="eastAsia" w:ascii="微软雅黑" w:hAnsi="微软雅黑" w:eastAsia="微软雅黑" w:cs="微软雅黑"/>
+          <w:lang w:val="en-US" w:eastAsia="zh-CN"/>
+        </w:rPr>
+      </w:pPr>
+    </w:p>
+    <w:p>
+      <w:pPr>
+        <w:rPr>
+          <w:rFonts w:hint="eastAsia" w:ascii="微软雅黑" w:hAnsi="微软雅黑" w:eastAsia="微软雅黑" w:cs="微软雅黑"/>
+          <w:b/>
+          <w:bCs/>
+        </w:rPr>
+      </w:pPr>
+      <w:r>
+        <w:rPr>
+          <w:rFonts w:hint="eastAsia" w:ascii="微软雅黑" w:hAnsi="微软雅黑" w:eastAsia="微软雅黑" w:cs="微软雅黑"/>
           <w:b/>
           <w:bCs/>
         </w:rPr>
@@ -524,15 +650,15 @@
     <w:p>
       <w:pPr>
         <w:rPr>
-          <w:rFonts w:hint="eastAsia"/>
-          <w:b w:val="0"/>
-          <w:bCs w:val="0"/>
-          <w:lang w:val="en-US" w:eastAsia="zh-CN"/>
-        </w:rPr>
-      </w:pPr>
-      <w:r>
-        <w:rPr>
-          <w:rFonts w:hint="eastAsia"/>
+          <w:rFonts w:hint="eastAsia" w:ascii="微软雅黑" w:hAnsi="微软雅黑" w:eastAsia="微软雅黑" w:cs="微软雅黑"/>
+          <w:b w:val="0"/>
+          <w:bCs w:val="0"/>
+          <w:lang w:val="en-US" w:eastAsia="zh-CN"/>
+        </w:rPr>
+      </w:pPr>
+      <w:r>
+        <w:rPr>
+          <w:rFonts w:hint="eastAsia" w:ascii="微软雅黑" w:hAnsi="微软雅黑" w:eastAsia="微软雅黑" w:cs="微软雅黑"/>
           <w:b w:val="0"/>
           <w:bCs w:val="0"/>
           <w:lang w:val="en-US" w:eastAsia="zh-CN"/>
@@ -543,15 +669,15 @@
     <w:p>
       <w:pPr>
         <w:rPr>
-          <w:rFonts w:hint="default"/>
-          <w:b w:val="0"/>
-          <w:bCs w:val="0"/>
-          <w:lang w:val="en-US" w:eastAsia="zh-CN"/>
-        </w:rPr>
-      </w:pPr>
-      <w:r>
-        <w:rPr>
-          <w:rFonts w:hint="eastAsia"/>
+          <w:rFonts w:hint="eastAsia" w:ascii="微软雅黑" w:hAnsi="微软雅黑" w:eastAsia="微软雅黑" w:cs="微软雅黑"/>
+          <w:b w:val="0"/>
+          <w:bCs w:val="0"/>
+          <w:lang w:val="en-US" w:eastAsia="zh-CN"/>
+        </w:rPr>
+      </w:pPr>
+      <w:r>
+        <w:rPr>
+          <w:rFonts w:hint="eastAsia" w:ascii="微软雅黑" w:hAnsi="微软雅黑" w:eastAsia="微软雅黑" w:cs="微软雅黑"/>
           <w:b w:val="0"/>
           <w:bCs w:val="0"/>
           <w:lang w:val="en-US" w:eastAsia="zh-CN"/>
@@ -559,16 +685,24 @@
         <w:t>MDX 采用其他的关键字来查询数据文体，返回可以进一步加以分析的数据，并提供了可对返回数据进行操作的相应函数。MDX 增加了用户自定义函数的功能，可以扩展或者定制用户某些特殊的商业需求。</w:t>
       </w:r>
     </w:p>
-    <w:p/>
-    <w:p>
-      <w:pPr>
-        <w:rPr>
-          <w:b/>
-          <w:bCs/>
-        </w:rPr>
-      </w:pPr>
-      <w:r>
-        <w:rPr>
+    <w:p>
+      <w:pPr>
+        <w:rPr>
+          <w:rFonts w:hint="eastAsia" w:ascii="微软雅黑" w:hAnsi="微软雅黑" w:eastAsia="微软雅黑" w:cs="微软雅黑"/>
+        </w:rPr>
+      </w:pPr>
+    </w:p>
+    <w:p>
+      <w:pPr>
+        <w:rPr>
+          <w:rFonts w:hint="eastAsia" w:ascii="微软雅黑" w:hAnsi="微软雅黑" w:eastAsia="微软雅黑" w:cs="微软雅黑"/>
+          <w:b/>
+          <w:bCs/>
+        </w:rPr>
+      </w:pPr>
+      <w:r>
+        <w:rPr>
+          <w:rFonts w:hint="eastAsia" w:ascii="微软雅黑" w:hAnsi="微软雅黑" w:eastAsia="微软雅黑" w:cs="微软雅黑"/>
           <w:b/>
           <w:bCs/>
         </w:rPr>
@@ -578,13 +712,13 @@
     <w:p>
       <w:pPr>
         <w:rPr>
-          <w:rFonts w:hint="default"/>
-          <w:lang w:val="en-US" w:eastAsia="zh-CN"/>
-        </w:rPr>
-      </w:pPr>
-      <w:r>
-        <w:rPr>
-          <w:rFonts w:hint="eastAsia"/>
+          <w:rFonts w:hint="eastAsia" w:ascii="微软雅黑" w:hAnsi="微软雅黑" w:eastAsia="微软雅黑" w:cs="微软雅黑"/>
+          <w:lang w:val="en-US" w:eastAsia="zh-CN"/>
+        </w:rPr>
+      </w:pPr>
+      <w:r>
+        <w:rPr>
+          <w:rFonts w:hint="eastAsia" w:ascii="微软雅黑" w:hAnsi="微软雅黑" w:eastAsia="微软雅黑" w:cs="微软雅黑"/>
           <w:lang w:val="en-US" w:eastAsia="zh-CN"/>
         </w:rPr>
         <w:t>分布型函数：可以把数据切分为 n 份，按 n 分进行运算后，再对 n 个值进行计算后结果与不切分为 n 分计算是一致的，就叫分布型函数，如果count</w:t>
@@ -593,13 +727,13 @@
     <w:p>
       <w:pPr>
         <w:rPr>
-          <w:rFonts w:hint="default"/>
-          <w:lang w:val="en-US" w:eastAsia="zh-CN"/>
-        </w:rPr>
-      </w:pPr>
-      <w:r>
-        <w:rPr>
-          <w:rFonts w:hint="eastAsia"/>
+          <w:rFonts w:hint="eastAsia" w:ascii="微软雅黑" w:hAnsi="微软雅黑" w:eastAsia="微软雅黑" w:cs="微软雅黑"/>
+          <w:lang w:val="en-US" w:eastAsia="zh-CN"/>
+        </w:rPr>
+      </w:pPr>
+      <w:r>
+        <w:rPr>
+          <w:rFonts w:hint="eastAsia" w:ascii="微软雅黑" w:hAnsi="微软雅黑" w:eastAsia="微软雅黑" w:cs="微软雅黑"/>
           <w:lang w:val="en-US" w:eastAsia="zh-CN"/>
         </w:rPr>
         <w:t>代数型函数：可以由若干个分布型函数经过代数运算得到的叫代数型函数 average</w:t>
@@ -608,13 +742,13 @@
     <w:p>
       <w:pPr>
         <w:rPr>
-          <w:rFonts w:hint="eastAsia"/>
-          <w:lang w:val="en-US" w:eastAsia="zh-CN"/>
-        </w:rPr>
-      </w:pPr>
-      <w:r>
-        <w:rPr>
-          <w:rFonts w:hint="eastAsia"/>
+          <w:rFonts w:hint="eastAsia" w:ascii="微软雅黑" w:hAnsi="微软雅黑" w:eastAsia="微软雅黑" w:cs="微软雅黑"/>
+          <w:lang w:val="en-US" w:eastAsia="zh-CN"/>
+        </w:rPr>
+      </w:pPr>
+      <w:r>
+        <w:rPr>
+          <w:rFonts w:hint="eastAsia" w:ascii="微软雅黑" w:hAnsi="微软雅黑" w:eastAsia="微软雅黑" w:cs="微软雅黑"/>
           <w:lang w:val="en-US" w:eastAsia="zh-CN"/>
         </w:rPr>
         <w:t>整体型函数：不能由分布型与代数型函数计算，而只能由所有数据计算而得到的叫整体型，如果median</w:t>
@@ -623,20 +757,22 @@
     <w:p>
       <w:pPr>
         <w:rPr>
-          <w:rFonts w:hint="default"/>
-          <w:lang w:val="en-US" w:eastAsia="zh-CN"/>
-        </w:rPr>
-      </w:pPr>
-    </w:p>
-    <w:p>
-      <w:pPr>
-        <w:rPr>
-          <w:b/>
-          <w:bCs/>
-        </w:rPr>
-      </w:pPr>
-      <w:r>
-        <w:rPr>
+          <w:rFonts w:hint="eastAsia" w:ascii="微软雅黑" w:hAnsi="微软雅黑" w:eastAsia="微软雅黑" w:cs="微软雅黑"/>
+          <w:lang w:val="en-US" w:eastAsia="zh-CN"/>
+        </w:rPr>
+      </w:pPr>
+    </w:p>
+    <w:p>
+      <w:pPr>
+        <w:rPr>
+          <w:rFonts w:hint="eastAsia" w:ascii="微软雅黑" w:hAnsi="微软雅黑" w:eastAsia="微软雅黑" w:cs="微软雅黑"/>
+          <w:b/>
+          <w:bCs/>
+        </w:rPr>
+      </w:pPr>
+      <w:r>
+        <w:rPr>
+          <w:rFonts w:hint="eastAsia" w:ascii="微软雅黑" w:hAnsi="微软雅黑" w:eastAsia="微软雅黑" w:cs="微软雅黑"/>
           <w:b/>
           <w:bCs/>
         </w:rPr>
@@ -646,15 +782,15 @@
     <w:p>
       <w:pPr>
         <w:rPr>
-          <w:rFonts w:hint="default" w:eastAsiaTheme="minorEastAsia"/>
-          <w:b w:val="0"/>
-          <w:bCs w:val="0"/>
-          <w:lang w:val="en-US" w:eastAsia="zh-CN"/>
-        </w:rPr>
-      </w:pPr>
-      <w:r>
-        <w:rPr>
-          <w:rFonts w:hint="eastAsia"/>
+          <w:rFonts w:hint="eastAsia" w:ascii="微软雅黑" w:hAnsi="微软雅黑" w:eastAsia="微软雅黑" w:cs="微软雅黑"/>
+          <w:b w:val="0"/>
+          <w:bCs w:val="0"/>
+          <w:lang w:val="en-US" w:eastAsia="zh-CN"/>
+        </w:rPr>
+      </w:pPr>
+      <w:r>
+        <w:rPr>
+          <w:rFonts w:hint="eastAsia" w:ascii="微软雅黑" w:hAnsi="微软雅黑" w:eastAsia="微软雅黑" w:cs="微软雅黑"/>
           <w:b w:val="0"/>
           <w:bCs w:val="0"/>
           <w:lang w:val="en-US" w:eastAsia="zh-CN"/>
@@ -662,30 +798,44 @@
         <w:t>包括维，度量，数据文体，数据单元等</w:t>
       </w:r>
     </w:p>
-    <w:p/>
+    <w:p>
+      <w:pPr>
+        <w:rPr>
+          <w:rFonts w:hint="eastAsia" w:ascii="微软雅黑" w:hAnsi="微软雅黑" w:eastAsia="微软雅黑" w:cs="微软雅黑"/>
+        </w:rPr>
+      </w:pPr>
+    </w:p>
     <w:p>
       <w:pPr>
         <w:outlineLvl w:val="0"/>
-      </w:pPr>
-      <w:r>
-        <w:rPr>
-          <w:rFonts w:hint="eastAsia"/>
+        <w:rPr>
+          <w:rFonts w:hint="eastAsia" w:ascii="微软雅黑" w:hAnsi="微软雅黑" w:eastAsia="微软雅黑" w:cs="微软雅黑"/>
+        </w:rPr>
+      </w:pPr>
+      <w:r>
+        <w:rPr>
+          <w:rFonts w:hint="eastAsia" w:ascii="微软雅黑" w:hAnsi="微软雅黑" w:eastAsia="微软雅黑" w:cs="微软雅黑"/>
         </w:rPr>
         <w:t>三、</w:t>
       </w:r>
       <w:r>
+        <w:rPr>
+          <w:rFonts w:hint="eastAsia" w:ascii="微软雅黑" w:hAnsi="微软雅黑" w:eastAsia="微软雅黑" w:cs="微软雅黑"/>
+        </w:rPr>
         <w:t>论述题</w:t>
       </w:r>
     </w:p>
     <w:p>
       <w:pPr>
         <w:rPr>
-          <w:b/>
-          <w:bCs/>
-        </w:rPr>
-      </w:pPr>
-      <w:r>
-        <w:rPr>
+          <w:rFonts w:hint="eastAsia" w:ascii="微软雅黑" w:hAnsi="微软雅黑" w:eastAsia="微软雅黑" w:cs="微软雅黑"/>
+          <w:b/>
+          <w:bCs/>
+        </w:rPr>
+      </w:pPr>
+      <w:r>
+        <w:rPr>
+          <w:rFonts w:hint="eastAsia" w:ascii="微软雅黑" w:hAnsi="微软雅黑" w:eastAsia="微软雅黑" w:cs="微软雅黑"/>
           <w:b/>
           <w:bCs/>
         </w:rPr>
@@ -695,15 +845,15 @@
     <w:p>
       <w:pPr>
         <w:rPr>
-          <w:rFonts w:hint="default" w:eastAsiaTheme="minorEastAsia"/>
-          <w:b w:val="0"/>
-          <w:bCs w:val="0"/>
-          <w:lang w:val="en-US" w:eastAsia="zh-CN"/>
-        </w:rPr>
-      </w:pPr>
-      <w:r>
-        <w:rPr>
-          <w:rFonts w:hint="eastAsia"/>
+          <w:rFonts w:hint="eastAsia" w:ascii="微软雅黑" w:hAnsi="微软雅黑" w:eastAsia="微软雅黑" w:cs="微软雅黑"/>
+          <w:b w:val="0"/>
+          <w:bCs w:val="0"/>
+          <w:lang w:val="en-US" w:eastAsia="zh-CN"/>
+        </w:rPr>
+      </w:pPr>
+      <w:r>
+        <w:rPr>
+          <w:rFonts w:hint="eastAsia" w:ascii="微软雅黑" w:hAnsi="微软雅黑" w:eastAsia="微软雅黑" w:cs="微软雅黑"/>
           <w:b w:val="0"/>
           <w:bCs w:val="0"/>
           <w:lang w:val="en-US" w:eastAsia="zh-CN"/>
@@ -714,15 +864,15 @@
     <w:p>
       <w:pPr>
         <w:rPr>
-          <w:rFonts w:hint="eastAsia"/>
-          <w:b w:val="0"/>
-          <w:bCs w:val="0"/>
-          <w:lang w:val="en-US" w:eastAsia="zh-CN"/>
-        </w:rPr>
-      </w:pPr>
-      <w:r>
-        <w:rPr>
-          <w:rFonts w:hint="eastAsia"/>
+          <w:rFonts w:hint="eastAsia" w:ascii="微软雅黑" w:hAnsi="微软雅黑" w:eastAsia="微软雅黑" w:cs="微软雅黑"/>
+          <w:b w:val="0"/>
+          <w:bCs w:val="0"/>
+          <w:lang w:val="en-US" w:eastAsia="zh-CN"/>
+        </w:rPr>
+      </w:pPr>
+      <w:r>
+        <w:rPr>
+          <w:rFonts w:hint="eastAsia" w:ascii="微软雅黑" w:hAnsi="微软雅黑" w:eastAsia="微软雅黑" w:cs="微软雅黑"/>
           <w:b w:val="0"/>
           <w:bCs w:val="0"/>
           <w:lang w:val="en-US" w:eastAsia="zh-CN"/>
@@ -733,15 +883,15 @@
     <w:p>
       <w:pPr>
         <w:rPr>
-          <w:rFonts w:hint="default"/>
-          <w:b w:val="0"/>
-          <w:bCs w:val="0"/>
-          <w:lang w:val="en-US" w:eastAsia="zh-CN"/>
-        </w:rPr>
-      </w:pPr>
-      <w:r>
-        <w:rPr>
-          <w:rFonts w:hint="eastAsia"/>
+          <w:rFonts w:hint="eastAsia" w:ascii="微软雅黑" w:hAnsi="微软雅黑" w:eastAsia="微软雅黑" w:cs="微软雅黑"/>
+          <w:b w:val="0"/>
+          <w:bCs w:val="0"/>
+          <w:lang w:val="en-US" w:eastAsia="zh-CN"/>
+        </w:rPr>
+      </w:pPr>
+      <w:r>
+        <w:rPr>
+          <w:rFonts w:hint="eastAsia" w:ascii="微软雅黑" w:hAnsi="微软雅黑" w:eastAsia="微软雅黑" w:cs="微软雅黑"/>
           <w:b w:val="0"/>
           <w:bCs w:val="0"/>
           <w:lang w:val="en-US" w:eastAsia="zh-CN"/>
@@ -752,15 +902,15 @@
     <w:p>
       <w:pPr>
         <w:rPr>
-          <w:rFonts w:hint="eastAsia"/>
-          <w:b w:val="0"/>
-          <w:bCs w:val="0"/>
-          <w:lang w:val="en-US" w:eastAsia="zh-CN"/>
-        </w:rPr>
-      </w:pPr>
-      <w:r>
-        <w:rPr>
-          <w:rFonts w:hint="eastAsia"/>
+          <w:rFonts w:hint="eastAsia" w:ascii="微软雅黑" w:hAnsi="微软雅黑" w:eastAsia="微软雅黑" w:cs="微软雅黑"/>
+          <w:b w:val="0"/>
+          <w:bCs w:val="0"/>
+          <w:lang w:val="en-US" w:eastAsia="zh-CN"/>
+        </w:rPr>
+      </w:pPr>
+      <w:r>
+        <w:rPr>
+          <w:rFonts w:hint="eastAsia" w:ascii="微软雅黑" w:hAnsi="微软雅黑" w:eastAsia="微软雅黑" w:cs="微软雅黑"/>
           <w:b w:val="0"/>
           <w:bCs w:val="0"/>
           <w:lang w:val="en-US" w:eastAsia="zh-CN"/>
@@ -771,15 +921,15 @@
     <w:p>
       <w:pPr>
         <w:rPr>
-          <w:rFonts w:hint="eastAsia"/>
-          <w:b w:val="0"/>
-          <w:bCs w:val="0"/>
-          <w:lang w:val="en-US" w:eastAsia="zh-CN"/>
-        </w:rPr>
-      </w:pPr>
-      <w:r>
-        <w:rPr>
-          <w:rFonts w:hint="eastAsia"/>
+          <w:rFonts w:hint="eastAsia" w:ascii="微软雅黑" w:hAnsi="微软雅黑" w:eastAsia="微软雅黑" w:cs="微软雅黑"/>
+          <w:b w:val="0"/>
+          <w:bCs w:val="0"/>
+          <w:lang w:val="en-US" w:eastAsia="zh-CN"/>
+        </w:rPr>
+      </w:pPr>
+      <w:r>
+        <w:rPr>
+          <w:rFonts w:hint="eastAsia" w:ascii="微软雅黑" w:hAnsi="微软雅黑" w:eastAsia="微软雅黑" w:cs="微软雅黑"/>
           <w:b w:val="0"/>
           <w:bCs w:val="0"/>
           <w:lang w:val="en-US" w:eastAsia="zh-CN"/>
@@ -790,37 +940,85 @@
     <w:p>
       <w:pPr>
         <w:rPr>
-          <w:rFonts w:hint="default"/>
-          <w:b w:val="0"/>
-          <w:bCs w:val="0"/>
-          <w:lang w:val="en-US" w:eastAsia="zh-CN"/>
-        </w:rPr>
-      </w:pPr>
-      <w:r>
-        <w:rPr>
-          <w:rFonts w:hint="eastAsia"/>
+          <w:rFonts w:hint="eastAsia" w:ascii="微软雅黑" w:hAnsi="微软雅黑" w:eastAsia="微软雅黑" w:cs="微软雅黑"/>
+          <w:b w:val="0"/>
+          <w:bCs w:val="0"/>
+          <w:lang w:val="en-US" w:eastAsia="zh-CN"/>
+        </w:rPr>
+      </w:pPr>
+      <w:r>
+        <w:rPr>
+          <w:rFonts w:hint="eastAsia" w:ascii="微软雅黑" w:hAnsi="微软雅黑" w:eastAsia="微软雅黑" w:cs="微软雅黑"/>
           <w:b w:val="0"/>
           <w:bCs w:val="0"/>
           <w:lang w:val="en-US" w:eastAsia="zh-CN"/>
         </w:rPr>
         <w:t>数据是当前或接近当前的：所谓”当前“是指数据在存取 时刻是最新的，而”接近当前“则是指存取的数据是最近一段时间之前得到的。</w:t>
       </w:r>
-      <w:bookmarkStart w:id="0" w:name="_GoBack"/>
-      <w:bookmarkEnd w:id="0"/>
-    </w:p>
-    <w:p>
-      <w:pPr>
-        <w:rPr>
-          <w:rFonts w:hint="default"/>
-          <w:b w:val="0"/>
-          <w:bCs w:val="0"/>
-          <w:lang w:val="en-US" w:eastAsia="zh-CN"/>
-        </w:rPr>
-      </w:pPr>
-    </w:p>
-    <w:p>
-      <w:r>
+    </w:p>
+    <w:p>
+      <w:pPr>
+        <w:rPr>
+          <w:rFonts w:hint="eastAsia" w:ascii="微软雅黑" w:hAnsi="微软雅黑" w:eastAsia="微软雅黑" w:cs="微软雅黑"/>
+          <w:b w:val="0"/>
+          <w:bCs w:val="0"/>
+          <w:lang w:val="en-US" w:eastAsia="zh-CN"/>
+        </w:rPr>
+      </w:pPr>
+    </w:p>
+    <w:p>
+      <w:pPr>
+        <w:rPr>
+          <w:rFonts w:hint="eastAsia" w:ascii="微软雅黑" w:hAnsi="微软雅黑" w:eastAsia="微软雅黑" w:cs="微软雅黑"/>
+          <w:b/>
+          <w:bCs/>
+        </w:rPr>
+      </w:pPr>
+      <w:r>
+        <w:rPr>
+          <w:rFonts w:hint="eastAsia" w:ascii="微软雅黑" w:hAnsi="微软雅黑" w:eastAsia="微软雅黑" w:cs="微软雅黑"/>
+          <w:b/>
+          <w:bCs/>
+        </w:rPr>
         <w:t>雪花模型的缺点，如何改进</w:t>
+      </w:r>
+    </w:p>
+    <w:p>
+      <w:pPr>
+        <w:rPr>
+          <w:rFonts w:hint="eastAsia" w:ascii="微软雅黑" w:hAnsi="微软雅黑" w:eastAsia="微软雅黑" w:cs="微软雅黑"/>
+          <w:b w:val="0"/>
+          <w:bCs w:val="0"/>
+          <w:lang w:val="en-US" w:eastAsia="zh-CN"/>
+        </w:rPr>
+      </w:pPr>
+      <w:r>
+        <w:rPr>
+          <w:rFonts w:hint="eastAsia" w:ascii="微软雅黑" w:hAnsi="微软雅黑" w:eastAsia="微软雅黑" w:cs="微软雅黑"/>
+          <w:b w:val="0"/>
+          <w:bCs w:val="0"/>
+          <w:lang w:val="en-US" w:eastAsia="zh-CN"/>
+        </w:rPr>
+        <w:t>雪花模型是对星形模型的维表进行规范化后得到的，用多张表描述一个复杂维，表达清晰，易于维护。雪花模型的缺点主要是，因为多张表来描述一个复杂的维，所以进行查询时会需要进行较多的连接，影响系统的性能。</w:t>
+      </w:r>
+    </w:p>
+    <w:p>
+      <w:pPr>
+        <w:rPr>
+          <w:rFonts w:hint="eastAsia" w:ascii="微软雅黑" w:hAnsi="微软雅黑" w:eastAsia="微软雅黑" w:cs="微软雅黑"/>
+          <w:b w:val="0"/>
+          <w:bCs w:val="0"/>
+          <w:lang w:val="en-US" w:eastAsia="zh-CN"/>
+        </w:rPr>
+      </w:pPr>
+      <w:r>
+        <w:rPr>
+          <w:rFonts w:hint="eastAsia" w:ascii="微软雅黑" w:hAnsi="微软雅黑" w:eastAsia="微软雅黑" w:cs="微软雅黑"/>
+          <w:b w:val="0"/>
+          <w:bCs w:val="0"/>
+          <w:lang w:val="en-US" w:eastAsia="zh-CN"/>
+        </w:rPr>
+        <w:t>改进措施：可以对雪花模型与星形模型相结合，对大维表进行规范节省存储空间，但对较小的维表仍按星形模型方式储存，这样可以减少多表连接引起的性能衰减，提高雪花模型的性能。</w:t>
       </w:r>
     </w:p>
     <w:sectPr>

</xml_diff>